<commit_message>
Fix primary scenario K=5 consistency in RSM manuscript and regenerate package
Co-Authored-By: Tatsuki Onishi <bougtoir@gmail.com>
</commit_message>
<xml_diff>
--- a/results/manuscript/rsm_submission/IONE_rsm_manuscript.docx
+++ b/results/manuscript/rsm_submission/IONE_rsm_manuscript.docx
@@ -31,7 +31,7 @@
     </w:p>
     <w:p>
       <w:r>
-        <w:t>Background. Random-effects meta-analyses report an average treatment effect and assume that between-study heterogeneity has been adequately modelled. When an individual participant data (IPD) meta-analysis contains hidden effect modifiers or confounders, a marginal summary can be non-robust or qualitatively wrong (aggregation bias). Methods. We simulated an IPD meta-analysis with 10 studies, binary treatment and outcome, measured covariates carrying traces of an unmeasured effect-modifier, and study-level variation in baseline risk and treatment prevalence. Proposed IONE methods and active comparators were used to stratify the pooled IPD; stratum-specific risk differences were pooled with two-stage fixed-effect and DerSimonian-Laird random-effects meta-analysis. We report ARI with a constructed true-Z partition, C1 (between-stratum heterogeneity of A→Y log odds ratios), W (within-stratum CATE homogeneity), and ATE bias reduction on the risk-difference scale. Results. In the primary scenario (n=2000, 10 studies, K=3 strata), the best method was 1B_residual (ARI 0.032; C1 0.936; W_true 0.363; W_est 0.085). Crude absolute ATE bias was 0.01938; stratification reduced this to 0.01263 (relative reduction 0.348), and random-effects pooling across discovered strata further reduced it to 0.00826 (relative reduction 0.574). Diagnostic agreement with the true hidden structure remained modest, and performance improved with stronger covariate traces and larger samples. Conclusions. IONE is a transparent, exploratory diagnostic for hidden effect modification within IPD meta-analyses. It should be reported alongside—not instead of—conventional meta-analytic models and covariate adjustment.</w:t>
+        <w:t>Background. Random-effects meta-analyses report an average treatment effect and assume that between-study heterogeneity has been adequately modelled. When an individual participant data (IPD) meta-analysis contains hidden effect modifiers or confounders, a marginal summary can be non-robust or qualitatively wrong (aggregation bias). Methods. We simulated an IPD meta-analysis with 10 studies, binary treatment and outcome, measured covariates carrying traces of an unmeasured effect-modifier, and study-level variation in baseline risk and treatment prevalence. Proposed IONE methods and active comparators were used to stratify the pooled IPD; stratum-specific risk differences were pooled with two-stage fixed-effect and DerSimonian-Laird random-effects meta-analysis. We report ARI with a constructed true-Z partition, C1 (between-stratum heterogeneity of A→Y log odds ratios), W (within-stratum CATE homogeneity), and ATE bias reduction on the risk-difference scale. Results. In the primary scenario (n=2000, 10 studies, K=5 strata), the best method was 1B_residual (ARI 0.032; C1 0.936; W_true 0.363; W_est 0.085). Crude absolute ATE bias was 0.01938; stratification reduced this to 0.01263 (relative reduction 0.348), and random-effects pooling across discovered strata further reduced it to 0.00826 (relative reduction 0.574). Diagnostic agreement with the true hidden structure remained modest, and performance improved with stronger covariate traces and larger samples. Conclusions. IONE is a transparent, exploratory diagnostic for hidden effect modification within IPD meta-analyses. It should be reported alongside—not instead of—conventional meta-analytic models and covariate adjustment.</w:t>
       </w:r>
     </w:p>
     <w:p/>
@@ -213,7 +213,7 @@
     </w:p>
     <w:p>
       <w:r>
-        <w:t>Table 1 and Figure 1 summarise the primary IPD scenario (n=2000, 10 studies, K=3 strata). Extraction of the true hidden structure was modest: the best ARI was 0.032, observed for 1B_residual, and the average C1 across methods was 0.889. Average within-stratum homogeneity was also limited (mean W_true = 0.240; mean W_est = 0.083), indicating that the strata still contained substantial CATE variation. For comparison, random-effects pooling across the true study identifiers (i.e. study-level meta-analysis) gave an absolute ATE bias of 0.01769 (reduction 0.00169 from crude 0.01938).</w:t>
+        <w:t>Table 1 and Figure 1 summarise the primary IPD scenario (n=2000, 10 studies, K=5 strata). Extraction of the true hidden structure was modest: the best ARI was 0.032, observed for 1B_residual, and the average C1 across methods was 0.889. Average within-stratum homogeneity was also limited (mean W_true = 0.240; mean W_est = 0.083), indicating that the strata still contained substantial CATE variation. For comparison, random-effects pooling across the true study identifiers (i.e. study-level meta-analysis) gave an absolute ATE bias of 0.01769 (reduction 0.00169 from crude 0.01938).</w:t>
       </w:r>
     </w:p>
     <w:p>
@@ -1626,7 +1626,7 @@
         <w:rPr>
           <w:b/>
         </w:rPr>
-        <w:t>Table 1. Primary IPD scenario (n=2000, 10 studies, K=3): means over 50 simulations.</w:t>
+        <w:t>Table 1. Primary IPD scenario (n=2000, 10 studies, K=5): means over 50 simulations.</w:t>
       </w:r>
     </w:p>
     <w:p/>

</xml_diff>

<commit_message>
Remove references to previous single-observation framing and regenerate RSM package
Co-Authored-By: Tatsuki Onishi <bougtoir@gmail.com>
</commit_message>
<xml_diff>
--- a/results/manuscript/rsm_submission/IONE_rsm_manuscript.docx
+++ b/results/manuscript/rsm_submission/IONE_rsm_manuscript.docx
@@ -126,7 +126,7 @@
     </w:p>
     <w:p>
       <w:r>
-        <w:t>We extend the IONE (Identifying hidden population structure and extracting it by stratification) framework to the IPD meta-analysis setting. We ask whether routine measured covariates can be used to stratify a pooled IPD so that within-stratum treatment effects are more homogeneous and the pooled estimate is less biased. We evaluate the proposal in a simulation study with explicit between-study heterogeneity and hidden effect modification, and illustrate behaviour with well-known Simpson-paradox examples.</w:t>
+        <w:t>We develop IONE (Identifying hidden population structure and extracting it by stratification) for the IPD meta-analysis setting. We ask whether routine measured covariates can be used to stratify a pooled IPD so that within-stratum treatment effects are more homogeneous and the pooled estimate is less biased. We evaluate the proposal in a simulation study with explicit between-study heterogeneity and hidden effect modification, and illustrate behaviour with well-known Simpson-paradox examples.</w:t>
       </w:r>
     </w:p>
     <w:p>
@@ -2313,7 +2313,7 @@
     </w:p>
     <w:p>
       <w:r>
-        <w:t>We extended IONE from a single-observation setting to an IPD meta-analysis setting and evaluated it as a diagnostic for hidden effect modification. In the simulation, data-driven stratification sometimes reduced ATE bias on the risk-difference scale, and random-effects pooling across discovered strata often improved on a simple two-stage stratified estimate. However, the strata only partially captured the true hidden Z structure, as shown by low ARI and moderate W values. Success was conditional on the confounder/effect-modifier leaving strong traces in the measured covariates and on a simple low-dimensional structure.</w:t>
+        <w:t>We framed IONE within an IPD meta-analysis setting and evaluated it as a diagnostic for hidden effect modification. In the simulation, data-driven stratification sometimes reduced ATE bias on the risk-difference scale, and random-effects pooling across discovered strata often improved on a simple two-stage stratified estimate. However, the strata only partially captured the true hidden Z structure, as shown by low ARI and moderate W values. Success was conditional on the confounder/effect-modifier leaving strong traces in the measured covariates and on a simple low-dimensional structure.</w:t>
       </w:r>
     </w:p>
     <w:p>

</xml_diff>

<commit_message>
Keep RSM IPD framing but make manuscript title start with IONE
- Update generate_rsm_manuscript.py title and title page to start with IONE

- Expand IONE acronym in Abstract

- Regenerate RSM manuscript, tables, title page, figures and v3 submission package

Co-Authored-By: Tatsuki Onishi <bougtoir@gmail.com>
</commit_message>
<xml_diff>
--- a/results/manuscript/rsm_submission/IONE_rsm_manuscript.docx
+++ b/results/manuscript/rsm_submission/IONE_rsm_manuscript.docx
@@ -8,7 +8,7 @@
         <w:jc w:val="center"/>
       </w:pPr>
       <w:r>
-        <w:t>A coherence diagnostic for hidden effect modification in individual participant data meta-analysis:</w:t>
+        <w:t>IONE: Incoherence-Oriented Neutralisation and Extraction for hidden effect modification</w:t>
       </w:r>
     </w:p>
     <w:p>
@@ -17,7 +17,7 @@
         <w:jc w:val="center"/>
       </w:pPr>
       <w:r>
-        <w:t>a simulation study of stratification-based extraction</w:t>
+        <w:t>in individual participant data meta-analysis: a simulation study of stratification-based extraction</w:t>
       </w:r>
     </w:p>
     <w:p/>
@@ -31,7 +31,7 @@
     </w:p>
     <w:p>
       <w:r>
-        <w:t>Background. Random-effects meta-analyses report an average treatment effect and assume that between-study heterogeneity has been adequately modelled. When an individual participant data (IPD) meta-analysis contains hidden effect modifiers or confounders, a marginal summary can be non-robust or qualitatively wrong (aggregation bias). Methods. We simulated an IPD meta-analysis with 10 studies, binary treatment and outcome, measured covariates carrying traces of an unmeasured effect-modifier, and study-level variation in baseline risk and treatment prevalence. Proposed IONE methods and active comparators were used to stratify the pooled IPD; stratum-specific risk differences were pooled with two-stage fixed-effect and DerSimonian-Laird random-effects meta-analysis. We report ARI with a constructed true-Z partition, C1 (between-stratum heterogeneity of A→Y log odds ratios), W (within-stratum CATE homogeneity), and ATE bias reduction on the risk-difference scale. Results. In the primary scenario (n=2000, 10 studies, K=5 strata), the best method was 1B_residual (ARI 0.032; C1 0.936; W_true 0.363; W_est 0.085). Crude absolute ATE bias was 0.01938; stratification reduced this to 0.01263 (relative reduction 0.348), and random-effects pooling across discovered strata further reduced it to 0.00826 (relative reduction 0.574). Diagnostic agreement with the true hidden structure remained modest, and performance improved with stronger covariate traces and larger samples. Conclusions. IONE is a transparent, exploratory diagnostic for hidden effect modification within IPD meta-analyses. It should be reported alongside—not instead of—conventional meta-analytic models and covariate adjustment.</w:t>
+        <w:t>Background. Random-effects meta-analyses report an average treatment effect and assume that between-study heterogeneity has been adequately modelled. When an individual participant data (IPD) meta-analysis contains hidden effect modifiers or confounders, a marginal summary can be non-robust or qualitatively wrong (aggregation bias). We propose IONE (Incoherence-Oriented Neutralisation and Extraction), an exploratory diagnostic toolkit for hidden effect modification. Methods. We simulated an IPD meta-analysis with 10 studies, binary treatment and outcome, measured covariates carrying traces of an unmeasured effect-modifier, and study-level variation in baseline risk and treatment prevalence. Proposed IONE methods and active comparators were used to stratify the pooled IPD; stratum-specific risk differences were pooled with two-stage fixed-effect and DerSimonian-Laird random-effects meta-analysis. We report ARI with a constructed true-Z partition, C1 (between-stratum heterogeneity of A→Y log odds ratios), W (within-stratum CATE homogeneity), and ATE bias reduction on the risk-difference scale. Results. In the primary scenario (n=2000, 10 studies, K=5 strata), the best method was 1B_residual (ARI 0.032; C1 0.936; W_true 0.363; W_est 0.085). Crude absolute ATE bias was 0.01938; stratification reduced this to 0.01263 (relative reduction 0.348), and random-effects pooling across discovered strata further reduced it to 0.00826 (relative reduction 0.574). Diagnostic agreement with the true hidden structure remained modest, and performance improved with stronger covariate traces and larger samples. Conclusions. IONE is a transparent, exploratory diagnostic for hidden effect modification within IPD meta-analyses. It should be reported alongside—not instead of—conventional meta-analytic models and covariate adjustment.</w:t>
       </w:r>
     </w:p>
     <w:p/>

</xml_diff>

<commit_message>
Fix gamma_x default in data_generation and regenerate RSM IPD results/manuscript
- Restore nonzero X -> treatment coefficients (0.01 per X) that were accidentally zeroed during IPD refactor

- Rerun run_rsm_ipd_simulation.py and regenerate summary/manuscript

- Keep IONE title with RSM IPD framing

Co-Authored-By: Tatsuki Onishi <bougtoir@gmail.com>
</commit_message>
<xml_diff>
--- a/results/manuscript/rsm_submission/IONE_rsm_manuscript.docx
+++ b/results/manuscript/rsm_submission/IONE_rsm_manuscript.docx
@@ -31,7 +31,7 @@
     </w:p>
     <w:p>
       <w:r>
-        <w:t>Background. Random-effects meta-analyses report an average treatment effect and assume that between-study heterogeneity has been adequately modelled. When an individual participant data (IPD) meta-analysis contains hidden effect modifiers or confounders, a marginal summary can be non-robust or qualitatively wrong (aggregation bias). We propose IONE (Incoherence-Oriented Neutralisation and Extraction), an exploratory diagnostic toolkit for hidden effect modification. Methods. We simulated an IPD meta-analysis with 10 studies, binary treatment and outcome, measured covariates carrying traces of an unmeasured effect-modifier, and study-level variation in baseline risk and treatment prevalence. Proposed IONE methods and active comparators were used to stratify the pooled IPD; stratum-specific risk differences were pooled with two-stage fixed-effect and DerSimonian-Laird random-effects meta-analysis. We report ARI with a constructed true-Z partition, C1 (between-stratum heterogeneity of A→Y log odds ratios), W (within-stratum CATE homogeneity), and ATE bias reduction on the risk-difference scale. Results. In the primary scenario (n=2000, 10 studies, K=5 strata), the best method was 1B_residual (ARI 0.032; C1 0.936; W_true 0.363; W_est 0.085). Crude absolute ATE bias was 0.01938; stratification reduced this to 0.01263 (relative reduction 0.348), and random-effects pooling across discovered strata further reduced it to 0.00826 (relative reduction 0.574). Diagnostic agreement with the true hidden structure remained modest, and performance improved with stronger covariate traces and larger samples. Conclusions. IONE is a transparent, exploratory diagnostic for hidden effect modification within IPD meta-analyses. It should be reported alongside—not instead of—conventional meta-analytic models and covariate adjustment.</w:t>
+        <w:t>Background. Random-effects meta-analyses report an average treatment effect and assume that between-study heterogeneity has been adequately modelled. When an individual participant data (IPD) meta-analysis contains hidden effect modifiers or confounders, a marginal summary can be non-robust or qualitatively wrong (aggregation bias). We propose IONE (Incoherence-Oriented Neutralisation and Extraction), an exploratory diagnostic toolkit for hidden effect modification. Methods. We simulated an IPD meta-analysis with 10 studies, binary treatment and outcome, measured covariates carrying traces of an unmeasured effect-modifier, and study-level variation in baseline risk and treatment prevalence. Proposed IONE methods and active comparators were used to stratify the pooled IPD; stratum-specific risk differences were pooled with two-stage fixed-effect and DerSimonian-Laird random-effects meta-analysis. We report ARI with a constructed true-Z partition, C1 (between-stratum heterogeneity of A→Y log odds ratios), W (within-stratum CATE homogeneity), and ATE bias reduction on the risk-difference scale. Results. In the primary scenario (n=2000, 10 studies, K=5 strata), the best method was 1B_residual (ARI 0.032; C1 0.927; W_true 0.363; W_est 0.078). Crude absolute ATE bias was 0.01865; stratification reduced this to 0.01345 (relative reduction 0.279), and random-effects pooling across discovered strata further reduced it to 0.00816 (relative reduction 0.563). Diagnostic agreement with the true hidden structure remained modest, and performance improved with stronger covariate traces and larger samples. Conclusions. IONE is a transparent, exploratory diagnostic for hidden effect modification within IPD meta-analyses. It should be reported alongside—not instead of—conventional meta-analytic models and covariate adjustment.</w:t>
       </w:r>
     </w:p>
     <w:p/>
@@ -213,12 +213,12 @@
     </w:p>
     <w:p>
       <w:r>
-        <w:t>Table 1 and Figure 1 summarise the primary IPD scenario (n=2000, 10 studies, K=5 strata). Extraction of the true hidden structure was modest: the best ARI was 0.032, observed for 1B_residual, and the average C1 across methods was 0.889. Average within-stratum homogeneity was also limited (mean W_true = 0.240; mean W_est = 0.083), indicating that the strata still contained substantial CATE variation. For comparison, random-effects pooling across the true study identifiers (i.e. study-level meta-analysis) gave an absolute ATE bias of 0.01769 (reduction 0.00169 from crude 0.01938).</w:t>
+        <w:t>Table 1 and Figure 1 summarise the primary IPD scenario (n=2000, 10 studies, K=5 strata). Extraction of the true hidden structure was modest: the best ARI was 0.032, observed for 1B_residual, and the average C1 across methods was 0.889. Average within-stratum homogeneity was also limited (mean W_true = 0.242; mean W_est = 0.078), indicating that the strata still contained substantial CATE variation. For comparison, random-effects pooling across the true study identifiers (i.e. study-level meta-analysis) gave an absolute ATE bias of 0.01568 (reduction 0.00296 from crude 0.01865).</w:t>
       </w:r>
     </w:p>
     <w:p>
       <w:r>
-        <w:t>ATE bias reduction was strongest for 1B_residual: the crude absolute risk-difference bias was 0.01938, the two-stage stratified estimate reduced this to 0.01263 (relative 0.348), and the random-effects estimate reduced it further to 0.00826 (relative 0.574). These values show that, under the simulated data-generating mechanism, a small number of data-driven strata can partially remove bias from a pooled IPD estimate, but the diagnostic agreement with the true hidden structure remains low.</w:t>
+        <w:t>ATE bias reduction was strongest for 1B_residual: the crude absolute risk-difference bias was 0.01865, the two-stage stratified estimate reduced this to 0.01345 (relative 0.279), and the random-effects estimate reduced it further to 0.00816 (relative 0.563). These values show that, under the simulated data-generating mechanism, a small number of data-driven strata can partially remove bias from a pooled IPD estimate, but the diagnostic agreement with the true hidden structure remains low.</w:t>
       </w:r>
     </w:p>
     <w:tbl>
@@ -412,7 +412,7 @@
           </w:tcPr>
           <w:p>
             <w:r>
-              <w:t>0.896</w:t>
+              <w:t>0.891</w:t>
             </w:r>
           </w:p>
         </w:tc>
@@ -432,7 +432,7 @@
           </w:tcPr>
           <w:p>
             <w:r>
-              <w:t>0.124</w:t>
+              <w:t>0.111</w:t>
             </w:r>
           </w:p>
         </w:tc>
@@ -462,7 +462,7 @@
           </w:tcPr>
           <w:p>
             <w:r>
-              <w:t>0.016</w:t>
+              <w:t>0.014</w:t>
             </w:r>
           </w:p>
         </w:tc>
@@ -472,7 +472,7 @@
           </w:tcPr>
           <w:p>
             <w:r>
-              <w:t>-0.002</w:t>
+              <w:t>-0.013</w:t>
             </w:r>
           </w:p>
         </w:tc>
@@ -482,7 +482,7 @@
           </w:tcPr>
           <w:p>
             <w:r>
-              <w:t>0.189</w:t>
+              <w:t>0.275</w:t>
             </w:r>
           </w:p>
         </w:tc>
@@ -492,7 +492,7 @@
           </w:tcPr>
           <w:p>
             <w:r>
-              <w:t>0.13</w:t>
+              <w:t>0.14</w:t>
             </w:r>
           </w:p>
         </w:tc>
@@ -524,7 +524,7 @@
           </w:tcPr>
           <w:p>
             <w:r>
-              <w:t>0.936</w:t>
+              <w:t>0.927</w:t>
             </w:r>
           </w:p>
         </w:tc>
@@ -544,7 +544,7 @@
           </w:tcPr>
           <w:p>
             <w:r>
-              <w:t>0.085</w:t>
+              <w:t>0.078</w:t>
             </w:r>
           </w:p>
         </w:tc>
@@ -584,7 +584,7 @@
           </w:tcPr>
           <w:p>
             <w:r>
-              <w:t>0.348</w:t>
+              <w:t>0.279</w:t>
             </w:r>
           </w:p>
         </w:tc>
@@ -594,7 +594,7 @@
           </w:tcPr>
           <w:p>
             <w:r>
-              <w:t>0.574</w:t>
+              <w:t>0.563</w:t>
             </w:r>
           </w:p>
         </w:tc>
@@ -604,7 +604,7 @@
           </w:tcPr>
           <w:p>
             <w:r>
-              <w:t>0.05</w:t>
+              <w:t>0.04</w:t>
             </w:r>
           </w:p>
         </w:tc>
@@ -636,7 +636,7 @@
           </w:tcPr>
           <w:p>
             <w:r>
-              <w:t>0.896</w:t>
+              <w:t>0.891</w:t>
             </w:r>
           </w:p>
         </w:tc>
@@ -656,7 +656,7 @@
           </w:tcPr>
           <w:p>
             <w:r>
-              <w:t>0.124</w:t>
+              <w:t>0.111</w:t>
             </w:r>
           </w:p>
         </w:tc>
@@ -686,7 +686,7 @@
           </w:tcPr>
           <w:p>
             <w:r>
-              <w:t>0.016</w:t>
+              <w:t>0.014</w:t>
             </w:r>
           </w:p>
         </w:tc>
@@ -696,7 +696,7 @@
           </w:tcPr>
           <w:p>
             <w:r>
-              <w:t>-0.002</w:t>
+              <w:t>-0.013</w:t>
             </w:r>
           </w:p>
         </w:tc>
@@ -706,7 +706,7 @@
           </w:tcPr>
           <w:p>
             <w:r>
-              <w:t>0.189</w:t>
+              <w:t>0.275</w:t>
             </w:r>
           </w:p>
         </w:tc>
@@ -716,7 +716,7 @@
           </w:tcPr>
           <w:p>
             <w:r>
-              <w:t>0.13</w:t>
+              <w:t>0.14</w:t>
             </w:r>
           </w:p>
         </w:tc>
@@ -748,7 +748,7 @@
           </w:tcPr>
           <w:p>
             <w:r>
-              <w:t>0.870</w:t>
+              <w:t>0.881</w:t>
             </w:r>
           </w:p>
         </w:tc>
@@ -768,7 +768,7 @@
           </w:tcPr>
           <w:p>
             <w:r>
-              <w:t>0.081</w:t>
+              <w:t>0.080</w:t>
             </w:r>
           </w:p>
         </w:tc>
@@ -808,7 +808,7 @@
           </w:tcPr>
           <w:p>
             <w:r>
-              <w:t>0.031</w:t>
+              <w:t>-0.010</w:t>
             </w:r>
           </w:p>
         </w:tc>
@@ -818,7 +818,7 @@
           </w:tcPr>
           <w:p>
             <w:r>
-              <w:t>0.075</w:t>
+              <w:t>0.051</w:t>
             </w:r>
           </w:p>
         </w:tc>
@@ -828,7 +828,7 @@
           </w:tcPr>
           <w:p>
             <w:r>
-              <w:t>0.16</w:t>
+              <w:t>0.13</w:t>
             </w:r>
           </w:p>
         </w:tc>
@@ -860,7 +860,7 @@
           </w:tcPr>
           <w:p>
             <w:r>
-              <w:t>0.868</w:t>
+              <w:t>0.865</w:t>
             </w:r>
           </w:p>
         </w:tc>
@@ -880,7 +880,7 @@
           </w:tcPr>
           <w:p>
             <w:r>
-              <w:t>0.157</w:t>
+              <w:t>0.143</w:t>
             </w:r>
           </w:p>
         </w:tc>
@@ -900,7 +900,7 @@
           </w:tcPr>
           <w:p>
             <w:r>
-              <w:t>0.019</w:t>
+              <w:t>0.018</w:t>
             </w:r>
           </w:p>
         </w:tc>
@@ -920,7 +920,7 @@
           </w:tcPr>
           <w:p>
             <w:r>
-              <w:t>0.016</w:t>
+              <w:t>0.037</w:t>
             </w:r>
           </w:p>
         </w:tc>
@@ -930,7 +930,7 @@
           </w:tcPr>
           <w:p>
             <w:r>
-              <w:t>0.117</w:t>
+              <w:t>0.115</w:t>
             </w:r>
           </w:p>
         </w:tc>
@@ -940,7 +940,7 @@
           </w:tcPr>
           <w:p>
             <w:r>
-              <w:t>0.13</w:t>
+              <w:t>0.15</w:t>
             </w:r>
           </w:p>
         </w:tc>
@@ -972,7 +972,7 @@
           </w:tcPr>
           <w:p>
             <w:r>
-              <w:t>0.905</w:t>
+              <w:t>0.895</w:t>
             </w:r>
           </w:p>
         </w:tc>
@@ -992,17 +992,7 @@
           </w:tcPr>
           <w:p>
             <w:r>
-              <w:t>0.095</w:t>
-            </w:r>
-          </w:p>
-        </w:tc>
-        <w:tc>
-          <w:tcPr>
-            <w:tcW w:type="dxa" w:w="785"/>
-          </w:tcPr>
-          <w:p>
-            <w:r>
-              <w:t>0.019</w:t>
+              <w:t>0.096</w:t>
             </w:r>
           </w:p>
         </w:tc>
@@ -1032,7 +1022,7 @@
           </w:tcPr>
           <w:p>
             <w:r>
-              <w:t>0.032</w:t>
+              <w:t>0.017</w:t>
             </w:r>
           </w:p>
         </w:tc>
@@ -1042,7 +1032,7 @@
           </w:tcPr>
           <w:p>
             <w:r>
-              <w:t>0.066</w:t>
+              <w:t>0.036</w:t>
             </w:r>
           </w:p>
         </w:tc>
@@ -1052,7 +1042,17 @@
           </w:tcPr>
           <w:p>
             <w:r>
-              <w:t>0.11</w:t>
+              <w:t>0.096</w:t>
+            </w:r>
+          </w:p>
+        </w:tc>
+        <w:tc>
+          <w:tcPr>
+            <w:tcW w:type="dxa" w:w="785"/>
+          </w:tcPr>
+          <w:p>
+            <w:r>
+              <w:t>0.13</w:t>
             </w:r>
           </w:p>
         </w:tc>
@@ -1074,7 +1074,7 @@
           </w:tcPr>
           <w:p>
             <w:r>
-              <w:t>0.003</w:t>
+              <w:t>0.005</w:t>
             </w:r>
           </w:p>
         </w:tc>
@@ -1084,7 +1084,7 @@
           </w:tcPr>
           <w:p>
             <w:r>
-              <w:t>0.850</w:t>
+              <w:t>0.881</w:t>
             </w:r>
           </w:p>
         </w:tc>
@@ -1094,7 +1094,7 @@
           </w:tcPr>
           <w:p>
             <w:r>
-              <w:t>0.028</w:t>
+              <w:t>0.050</w:t>
             </w:r>
           </w:p>
         </w:tc>
@@ -1104,7 +1104,7 @@
           </w:tcPr>
           <w:p>
             <w:r>
-              <w:t>0.048</w:t>
+              <w:t>0.059</w:t>
             </w:r>
           </w:p>
         </w:tc>
@@ -1124,7 +1124,7 @@
           </w:tcPr>
           <w:p>
             <w:r>
-              <w:t>0.019</w:t>
+              <w:t>0.018</w:t>
             </w:r>
           </w:p>
         </w:tc>
@@ -1134,7 +1134,7 @@
           </w:tcPr>
           <w:p>
             <w:r>
-              <w:t>0.019</w:t>
+              <w:t>0.018</w:t>
             </w:r>
           </w:p>
         </w:tc>
@@ -1144,7 +1144,7 @@
           </w:tcPr>
           <w:p>
             <w:r>
-              <w:t>0.033</w:t>
+              <w:t>0.026</w:t>
             </w:r>
           </w:p>
         </w:tc>
@@ -1154,7 +1154,7 @@
           </w:tcPr>
           <w:p>
             <w:r>
-              <w:t>0.033</w:t>
+              <w:t>0.059</w:t>
             </w:r>
           </w:p>
         </w:tc>
@@ -1164,7 +1164,7 @@
           </w:tcPr>
           <w:p>
             <w:r>
-              <w:t>0.17</w:t>
+              <w:t>0.14</w:t>
             </w:r>
           </w:p>
         </w:tc>
@@ -1186,7 +1186,7 @@
           </w:tcPr>
           <w:p>
             <w:r>
-              <w:t>0.027</w:t>
+              <w:t>0.026</w:t>
             </w:r>
           </w:p>
         </w:tc>
@@ -1196,7 +1196,7 @@
           </w:tcPr>
           <w:p>
             <w:r>
-              <w:t>0.884</w:t>
+              <w:t>0.858</w:t>
             </w:r>
           </w:p>
         </w:tc>
@@ -1206,7 +1206,7 @@
           </w:tcPr>
           <w:p>
             <w:r>
-              <w:t>0.324</w:t>
+              <w:t>0.322</w:t>
             </w:r>
           </w:p>
         </w:tc>
@@ -1216,7 +1216,7 @@
           </w:tcPr>
           <w:p>
             <w:r>
-              <w:t>0.117</w:t>
+              <w:t>0.107</w:t>
             </w:r>
           </w:p>
         </w:tc>
@@ -1236,7 +1236,7 @@
           </w:tcPr>
           <w:p>
             <w:r>
-              <w:t>0.019</w:t>
+              <w:t>0.018</w:t>
             </w:r>
           </w:p>
         </w:tc>
@@ -1246,7 +1246,7 @@
           </w:tcPr>
           <w:p>
             <w:r>
-              <w:t>0.015</w:t>
+              <w:t>0.014</w:t>
             </w:r>
           </w:p>
         </w:tc>
@@ -1256,7 +1256,7 @@
           </w:tcPr>
           <w:p>
             <w:r>
-              <w:t>0.017</w:t>
+              <w:t>0.009</w:t>
             </w:r>
           </w:p>
         </w:tc>
@@ -1266,7 +1266,7 @@
           </w:tcPr>
           <w:p>
             <w:r>
-              <w:t>0.211</w:t>
+              <w:t>0.233</w:t>
             </w:r>
           </w:p>
         </w:tc>
@@ -1308,7 +1308,7 @@
           </w:tcPr>
           <w:p>
             <w:r>
-              <w:t>0.936</w:t>
+              <w:t>0.913</w:t>
             </w:r>
           </w:p>
         </w:tc>
@@ -1328,7 +1328,7 @@
           </w:tcPr>
           <w:p>
             <w:r>
-              <w:t>0.035</w:t>
+              <w:t>0.030</w:t>
             </w:r>
           </w:p>
         </w:tc>
@@ -1368,7 +1368,7 @@
           </w:tcPr>
           <w:p>
             <w:r>
-              <w:t>-0.006</w:t>
+              <w:t>-0.019</w:t>
             </w:r>
           </w:p>
         </w:tc>
@@ -1378,7 +1378,7 @@
           </w:tcPr>
           <w:p>
             <w:r>
-              <w:t>0.113</w:t>
+              <w:t>0.115</w:t>
             </w:r>
           </w:p>
         </w:tc>
@@ -1388,7 +1388,7 @@
           </w:tcPr>
           <w:p>
             <w:r>
-              <w:t>0.10</w:t>
+              <w:t>0.12</w:t>
             </w:r>
           </w:p>
         </w:tc>
@@ -1420,7 +1420,7 @@
           </w:tcPr>
           <w:p>
             <w:r>
-              <w:t>0.880</w:t>
+              <w:t>0.897</w:t>
             </w:r>
           </w:p>
         </w:tc>
@@ -1440,7 +1440,7 @@
           </w:tcPr>
           <w:p>
             <w:r>
-              <w:t>0.047</w:t>
+              <w:t>0.042</w:t>
             </w:r>
           </w:p>
         </w:tc>
@@ -1460,7 +1460,7 @@
           </w:tcPr>
           <w:p>
             <w:r>
-              <w:t>0.017</w:t>
+              <w:t>0.016</w:t>
             </w:r>
           </w:p>
         </w:tc>
@@ -1480,7 +1480,7 @@
           </w:tcPr>
           <w:p>
             <w:r>
-              <w:t>0.114</w:t>
+              <w:t>0.131</w:t>
             </w:r>
           </w:p>
         </w:tc>
@@ -1490,7 +1490,7 @@
           </w:tcPr>
           <w:p>
             <w:r>
-              <w:t>0.332</w:t>
+              <w:t>0.321</w:t>
             </w:r>
           </w:p>
         </w:tc>
@@ -1532,7 +1532,7 @@
           </w:tcPr>
           <w:p>
             <w:r>
-              <w:t>0.863</w:t>
+              <w:t>0.883</w:t>
             </w:r>
           </w:p>
         </w:tc>
@@ -1572,7 +1572,7 @@
           </w:tcPr>
           <w:p>
             <w:r>
-              <w:t>0.019</w:t>
+              <w:t>0.018</w:t>
             </w:r>
           </w:p>
         </w:tc>
@@ -1592,7 +1592,7 @@
           </w:tcPr>
           <w:p>
             <w:r>
-              <w:t>0.001</w:t>
+              <w:t>0.010</w:t>
             </w:r>
           </w:p>
         </w:tc>
@@ -1602,7 +1602,7 @@
           </w:tcPr>
           <w:p>
             <w:r>
-              <w:t>-0.006</w:t>
+              <w:t>-0.019</w:t>
             </w:r>
           </w:p>
         </w:tc>
@@ -1612,7 +1612,7 @@
           </w:tcPr>
           <w:p>
             <w:r>
-              <w:t>0.14</w:t>
+              <w:t>0.12</w:t>
             </w:r>
           </w:p>
         </w:tc>
@@ -1635,7 +1635,7 @@
         <w:pStyle w:val="IntenseQuote"/>
       </w:pPr>
       <w:r>
-        <w:t>As a comparator, random-effects pooling across the true study identifiers gave an absolute bias of 0.018 (absolute reduction 0.002).</w:t>
+        <w:t>As a comparator, random-effects pooling across the true study identifiers gave an absolute bias of 0.016 (absolute reduction 0.003).</w:t>
       </w:r>
     </w:p>
     <w:p>

</xml_diff>

<commit_message>
Spell out IONE acronym at first use in Abstract and Introduction
Co-Authored-By: Tatsuki Onishi <bougtoir@gmail.com>
</commit_message>
<xml_diff>
--- a/results/manuscript/rsm_submission/IONE_rsm_manuscript.docx
+++ b/results/manuscript/rsm_submission/IONE_rsm_manuscript.docx
@@ -31,7 +31,7 @@
     </w:p>
     <w:p>
       <w:r>
-        <w:t>Background. Random-effects meta-analyses report an average treatment effect and assume that between-study heterogeneity has been adequately modelled. When an individual participant data (IPD) meta-analysis contains hidden effect modifiers or confounders, a marginal summary can be non-robust or qualitatively wrong (aggregation bias). We propose IONE (Incoherence-Oriented Neutralisation and Extraction), an exploratory diagnostic toolkit for hidden effect modification. Methods. We simulated an IPD meta-analysis with 10 studies, binary treatment and outcome, measured covariates carrying traces of an unmeasured effect-modifier, and study-level variation in baseline risk and treatment prevalence. Proposed IONE methods and active comparators were used to stratify the pooled IPD; stratum-specific risk differences were pooled with two-stage fixed-effect and DerSimonian-Laird random-effects meta-analysis. We report ARI with a constructed true-Z partition, C1 (between-stratum heterogeneity of A→Y log odds ratios), W (within-stratum CATE homogeneity), and ATE bias reduction on the risk-difference scale. Results. In the primary scenario (n=2000, 10 studies, K=5 strata), the best method was 1B_residual (ARI 0.032; C1 0.927; W_true 0.363; W_est 0.078). Crude absolute ATE bias was 0.01865; stratification reduced this to 0.01345 (relative reduction 0.279), and random-effects pooling across discovered strata further reduced it to 0.00816 (relative reduction 0.563). Diagnostic agreement with the true hidden structure remained modest, and performance improved with stronger covariate traces and larger samples. Conclusions. IONE is a transparent, exploratory diagnostic for hidden effect modification within IPD meta-analyses. It should be reported alongside—not instead of—conventional meta-analytic models and covariate adjustment.</w:t>
+        <w:t>Background. Random-effects meta-analyses report an average treatment effect and assume that between-study heterogeneity has been adequately modelled. When an individual participant data (IPD) meta-analysis contains hidden effect modifiers or confounders, a marginal summary can be non-robust or qualitatively wrong (aggregation bias). We propose Incoherence-Oriented Neutralisation and Extraction (IONE), an exploratory diagnostic toolkit for hidden effect modification. Methods. We simulated an IPD meta-analysis with 10 studies, binary treatment and outcome, measured covariates carrying traces of an unmeasured effect-modifier, and study-level variation in baseline risk and treatment prevalence. Proposed IONE methods and active comparators were used to stratify the pooled IPD; stratum-specific risk differences were pooled with two-stage fixed-effect and DerSimonian-Laird random-effects meta-analysis. We report ARI with a constructed true-Z partition, C1 (between-stratum heterogeneity of A→Y log odds ratios), W (within-stratum CATE homogeneity), and ATE bias reduction on the risk-difference scale. Results. In the primary scenario (n=2000, 10 studies, K=5 strata), the best method was 1B_residual (ARI 0.032; C1 0.927; W_true 0.363; W_est 0.078). Crude absolute ATE bias was 0.01865; stratification reduced this to 0.01345 (relative reduction 0.279), and random-effects pooling across discovered strata further reduced it to 0.00816 (relative reduction 0.563). Diagnostic agreement with the true hidden structure remained modest, and performance improved with stronger covariate traces and larger samples. Conclusions. IONE is a transparent, exploratory diagnostic for hidden effect modification within IPD meta-analyses. It should be reported alongside—not instead of—conventional meta-analytic models and covariate adjustment.</w:t>
       </w:r>
     </w:p>
     <w:p/>
@@ -126,7 +126,7 @@
     </w:p>
     <w:p>
       <w:r>
-        <w:t>We develop IONE (Identifying hidden population structure and extracting it by stratification) for the IPD meta-analysis setting. We ask whether routine measured covariates can be used to stratify a pooled IPD so that within-stratum treatment effects are more homogeneous and the pooled estimate is less biased. We evaluate the proposal in a simulation study with explicit between-study heterogeneity and hidden effect modification, and illustrate behaviour with well-known Simpson-paradox examples.</w:t>
+        <w:t>We develop Incoherence-Oriented Neutralisation and Extraction (IONE) for the IPD meta-analysis setting. We ask whether routine measured covariates can be used to stratify a pooled IPD so that within-stratum treatment effects are more homogeneous and the pooled estimate is less biased. We evaluate the proposal in a simulation study with explicit between-study heterogeneity and hidden effect modification, and illustrate behaviour with well-known Simpson-paradox examples.</w:t>
       </w:r>
     </w:p>
     <w:p>

</xml_diff>